<commit_message>
fix: corrigir links do resume em inglês
</commit_message>
<xml_diff>
--- a/public/resume-augusto-amado-2026.docx
+++ b/public/resume-augusto-amado-2026.docx
@@ -1,6 +1,6 @@
 
 <file path=word/document.xml><?xml version="1.0" encoding="utf-8"?>
-<w:document xmlns:w="http://schemas.openxmlformats.org/wordprocessingml/2006/main">
+<w:document xmlns:r="http://schemas.openxmlformats.org/officeDocument/2006/relationships" xmlns:w="http://schemas.openxmlformats.org/wordprocessingml/2006/main">
   <w:body>
     <w:p>
       <w:pPr>
@@ -278,20 +278,6 @@
       </w:r>
     </w:p>
     <w:p>
-      <w:pPr>
-        <w:spacing w:before="0" w:after="0" w:line="259"/>
-        <w:ind w:right="0" w:left="0" w:firstLine="0"/>
-        <w:jc w:val="left"/>
-        <w:rPr>
-          <w:rFonts w:ascii="Calibri" w:hAnsi="Calibri" w:cs="Calibri" w:eastAsia="Calibri"/>
-          <w:color w:val="0563C1"/>
-          <w:spacing w:val="0"/>
-          <w:position w:val="0"/>
-          <w:sz w:val="24"/>
-          <w:u w:val="single"/>
-          <w:shd w:fill="auto" w:val="clear"/>
-        </w:rPr>
-      </w:pPr>
       <w:r>
         <w:rPr>
           <w:rFonts w:ascii="Calibri" w:hAnsi="Calibri" w:cs="Calibri" w:eastAsia="Calibri"/>
@@ -301,34 +287,49 @@
           <w:sz w:val="24"/>
           <w:shd w:fill="auto" w:val="clear"/>
         </w:rPr>
-        <w:t>LinkedIn: https://www.linkedin.com/in/augusto-amado-89507823a</w:t>
-      </w:r>
-    </w:p>
-    <w:p>
-      <w:pPr>
-        <w:spacing w:before="0" w:after="0" w:line="259"/>
-        <w:ind w:right="0" w:left="0" w:firstLine="0"/>
-        <w:jc w:val="left"/>
-        <w:rPr>
-          <w:rFonts w:ascii="Calibri" w:hAnsi="Calibri" w:cs="Calibri" w:eastAsia="Calibri"/>
-          <w:color w:val="auto"/>
-          <w:spacing w:val="0"/>
-          <w:position w:val="0"/>
-          <w:sz w:val="24"/>
-          <w:shd w:fill="auto" w:val="clear"/>
-        </w:rPr>
-      </w:pPr>
-      <w:r>
-        <w:rPr>
-          <w:rFonts w:ascii="Calibri" w:hAnsi="Calibri" w:cs="Calibri" w:eastAsia="Calibri"/>
-          <w:color w:val="auto"/>
-          <w:spacing w:val="0"/>
-          <w:position w:val="0"/>
-          <w:sz w:val="24"/>
-          <w:shd w:fill="auto" w:val="clear"/>
-        </w:rPr>
-        <w:t>Portfolio: https://augustoamado.vercel.app/#portfolio</w:t>
-      </w:r>
+        <w:t xml:space="preserve">LinkedIn: </w:t>
+      </w:r>
+      <w:hyperlink r:id="docRId0">
+        <w:r>
+          <w:rPr>
+            <w:rFonts w:ascii="Calibri" w:hAnsi="Calibri" w:cs="Calibri" w:eastAsia="Calibri"/>
+            <w:color w:val="0563C1"/>
+            <w:spacing w:val="0"/>
+            <w:position w:val="0"/>
+            <w:sz w:val="24"/>
+            <w:shd w:fill="auto" w:val="clear"/>
+            <w:u w:val="single"/>
+          </w:rPr>
+          <w:t>https://www.linkedin.com/in/augusto-amado-89507823a</w:t>
+        </w:r>
+      </w:hyperlink>
+    </w:p>
+    <w:p>
+      <w:r>
+        <w:rPr>
+          <w:rFonts w:ascii="Calibri" w:hAnsi="Calibri" w:cs="Calibri" w:eastAsia="Calibri"/>
+          <w:color w:val="auto"/>
+          <w:spacing w:val="0"/>
+          <w:position w:val="0"/>
+          <w:sz w:val="24"/>
+          <w:shd w:fill="auto" w:val="clear"/>
+        </w:rPr>
+        <w:t xml:space="preserve">Portfolio: </w:t>
+      </w:r>
+      <w:hyperlink r:id="docRId1">
+        <w:r>
+          <w:rPr>
+            <w:rFonts w:ascii="Calibri" w:hAnsi="Calibri" w:cs="Calibri" w:eastAsia="Calibri"/>
+            <w:color w:val="0563C1"/>
+            <w:spacing w:val="0"/>
+            <w:position w:val="0"/>
+            <w:sz w:val="24"/>
+            <w:shd w:fill="auto" w:val="clear"/>
+            <w:u w:val="single"/>
+          </w:rPr>
+          <w:t>https://augustoamado.vercel.app/#portfolio</w:t>
+        </w:r>
+      </w:hyperlink>
     </w:p>
     <w:p>
       <w:pPr>

</xml_diff>